<commit_message>
Recria Ads: grupo do WhatsApp da turma, Acervo Recria, 1 ano de acesso, desconto em próximos cursos, obrigado com botões e posts para o feed
Co-Authored-By: Claude Opus 5.5 <noreply@anthropic.com>
Claude-Session: https://claude.ai/code/session_01RDM8d5cVD9w4uwiMSyLkgt
</commit_message>
<xml_diff>
--- a/agencia-recria/cursos/recria-ads/para-ler-e-gravar/Copies dos anuncios.docx
+++ b/agencia-recria/cursos/recria-ads/para-ler-e-gravar/Copies dos anuncios.docx
@@ -29,6 +29,209 @@
           <w:color w:val="0B0B0B"/>
         </w:rPr>
         <w:t>Recria Ads · Copies dos anúncios</w:t>
+      </w:r>
+    </w:p>
+    <w:p>
+      <w:pPr>
+        <w:pStyle w:val="Heading2"/>
+      </w:pPr>
+      <w:r>
+        <w:rPr>
+          <w:color w:val="9A7424"/>
+        </w:rPr>
+        <w:t>Plano para começar com pouco orçamento (recomendado)</w:t>
+      </w:r>
+    </w:p>
+    <w:p>
+      <w:pPr>
+        <w:pStyle w:val="ListNumber"/>
+      </w:pPr>
+      <w:r>
+        <w:rPr>
+          <w:b/>
+          <w:color w:val="5A4412"/>
+        </w:rPr>
+        <w:t>Primeiro, no feed (orgânico + impulsionar para engajamento):</w:t>
+      </w:r>
+      <w:r>
+        <w:t xml:space="preserve"> os posts da pasta `feed/` terminam com "Comente RECRIA ADS". A automação do Youze entrega o presente e oferece o curso. Impulsionar para engajamento costuma sair bem mais barato do que uma campanha de vendas, e cada comentário ainda aumenta o alcance.</w:t>
+      </w:r>
+    </w:p>
+    <w:p>
+      <w:pPr>
+        <w:pStyle w:val="ListNumber"/>
+      </w:pPr>
+      <w:r>
+        <w:rPr>
+          <w:b/>
+          <w:color w:val="5A4412"/>
+        </w:rPr>
+        <w:t>Depois, quando as primeiras vendas entrarem:</w:t>
+      </w:r>
+      <w:r>
+        <w:t xml:space="preserve"> os anúncios diretos para a página (as campanhas 1 e 2 abaixo) e o remarketing (campanha 3).</w:t>
+      </w:r>
+    </w:p>
+    <w:p>
+      <w:pPr>
+        <w:pStyle w:val="Heading2"/>
+      </w:pPr>
+      <w:r>
+        <w:rPr>
+          <w:color w:val="9A7424"/>
+        </w:rPr>
+        <w:t>Posts para o feed (pasta feed/)</w:t>
+      </w:r>
+    </w:p>
+    <w:tbl>
+      <w:tblPr>
+        <w:tblStyle w:val="TableGrid"/>
+        <w:tblW w:type="auto" w:w="0"/>
+        <w:tblLook w:firstColumn="1" w:firstRow="1" w:lastColumn="0" w:lastRow="0" w:noHBand="0" w:noVBand="1" w:val="04A0"/>
+      </w:tblPr>
+      <w:tblGrid>
+        <w:gridCol w:w="4873"/>
+        <w:gridCol w:w="4873"/>
+      </w:tblGrid>
+      <w:tr>
+        <w:tc>
+          <w:tcPr>
+            <w:tcW w:type="dxa" w:w="4873"/>
+          </w:tcPr>
+          <w:p>
+            <w:r>
+              <w:rPr>
+                <w:b/>
+              </w:rPr>
+            </w:r>
+            <w:r>
+              <w:rPr>
+                <w:b/>
+              </w:rPr>
+              <w:t>Post</w:t>
+            </w:r>
+          </w:p>
+        </w:tc>
+        <w:tc>
+          <w:tcPr>
+            <w:tcW w:type="dxa" w:w="4873"/>
+          </w:tcPr>
+          <w:p>
+            <w:r>
+              <w:rPr>
+                <w:b/>
+              </w:rPr>
+            </w:r>
+            <w:r>
+              <w:rPr>
+                <w:b/>
+              </w:rPr>
+              <w:t>Legenda</w:t>
+            </w:r>
+          </w:p>
+        </w:tc>
+      </w:tr>
+      <w:tr>
+        <w:tc>
+          <w:tcPr>
+            <w:tcW w:type="dxa" w:w="4873"/>
+          </w:tcPr>
+          <w:p>
+            <w:r/>
+            <w:r>
+              <w:t>Carrossel "Você posta todo dia e ninguém compra?" (7 cards)</w:t>
+            </w:r>
+          </w:p>
+        </w:tc>
+        <w:tc>
+          <w:tcPr>
+            <w:tcW w:type="dxa" w:w="4873"/>
+          </w:tcPr>
+          <w:p>
+            <w:r/>
+            <w:r>
+              <w:t>Você posta todo dia e ninguém compra? Não é o algoritmo. É o jeito como o cérebro de quem rola o feed funciona. Arrasta até o fim. 👉 Comente RECRIA ADS e receba um presente no seu direct: o passo a passo para criar conteúdos e anúncios sem cara de anúncio. 🎁</w:t>
+            </w:r>
+          </w:p>
+        </w:tc>
+      </w:tr>
+      <w:tr>
+        <w:tc>
+          <w:tcPr>
+            <w:tcW w:type="dxa" w:w="4873"/>
+          </w:tcPr>
+          <w:p>
+            <w:r/>
+            <w:r>
+              <w:t>Post "Qual você pararia para ler?"</w:t>
+            </w:r>
+          </w:p>
+        </w:tc>
+        <w:tc>
+          <w:tcPr>
+            <w:tcW w:type="dxa" w:w="4873"/>
+          </w:tcPr>
+          <w:p>
+            <w:r/>
+            <w:r>
+              <w:t>Seja sincero(a): A ou B? 👇 Me conta nos comentários. E, se quiser aprender a criar o post B todo santo dia, comente RECRIA ADS que eu te mando um presente no direct. 🎁</w:t>
+            </w:r>
+          </w:p>
+        </w:tc>
+      </w:tr>
+      <w:tr>
+        <w:tc>
+          <w:tcPr>
+            <w:tcW w:type="dxa" w:w="4873"/>
+          </w:tcPr>
+          <w:p>
+            <w:r/>
+            <w:r>
+              <w:t>Post "O seu conteúdo tem cara de anúncio se"</w:t>
+            </w:r>
+          </w:p>
+        </w:tc>
+        <w:tc>
+          <w:tcPr>
+            <w:tcW w:type="dxa" w:w="4873"/>
+          </w:tcPr>
+          <w:p>
+            <w:r/>
+            <w:r>
+              <w:t>Quantos você marcou? 👀 Se foram 2 ou mais, o seu conteúdo está com cara de anúncio, e todo mundo aprendeu a pular anúncio. Comente RECRIA ADS e receba no direct o passo a passo para virar esse jogo. 🎁</w:t>
+            </w:r>
+          </w:p>
+        </w:tc>
+      </w:tr>
+      <w:tr>
+        <w:tc>
+          <w:tcPr>
+            <w:tcW w:type="dxa" w:w="4873"/>
+          </w:tcPr>
+          <w:p>
+            <w:r/>
+            <w:r>
+              <w:t>Post "Todo mundo pula anúncio. Inclusive você."</w:t>
+            </w:r>
+          </w:p>
+        </w:tc>
+        <w:tc>
+          <w:tcPr>
+            <w:tcW w:type="dxa" w:w="4873"/>
+          </w:tcPr>
+          <w:p>
+            <w:r/>
+            <w:r>
+              <w:t>Você pula. Eu pulo. Todo mundo pula. Mas todo mundo para por uma boa história. Comente RECRIA ADS e receba um presente no seu direct. 🎁</w:t>
+            </w:r>
+          </w:p>
+        </w:tc>
+      </w:tr>
+    </w:tbl>
+    <w:p/>
+    <w:p>
+      <w:r>
+        <w:t>Dica: poste o carrossel primeiro. Ele tende a gerar mais comentários e salvamentos. Os posts únicos funcionam melhor como reforço, ao longo das semanas seguintes.</w:t>
       </w:r>
     </w:p>
     <w:p>

</xml_diff>